<commit_message>
Data - 5/19/2026 part 2
</commit_message>
<xml_diff>
--- a/Data/Private Data/Data Collections 5-19-2026.docx
+++ b/Data/Private Data/Data Collections 5-19-2026.docx
@@ -17,12 +17,12 @@
     </w:p>
     <w:p>
       <w:r>
-        <w:t>Total Rows: 5645</w:t>
+        <w:t>Total Rows: 5646</w:t>
       </w:r>
     </w:p>
     <w:p>
       <w:r>
-        <w:t>Total Columns: 1620</w:t>
+        <w:t>Total Columns: 1621</w:t>
       </w:r>
     </w:p>
     <w:p>
@@ -1598,7 +1598,7 @@
           <w:b w:val="0"/>
           <w:sz w:val="18"/>
         </w:rPr>
-        <w:t>46 x 12</w:t>
+        <w:t>47 x 13</w:t>
       </w:r>
       <w:r>
         <w:rPr>

</xml_diff>